<commit_message>
Adicioando um arquivo docx acerca do levamento de requisitos da Empresa Parceira e especificações do que deverá estar contido no banco de dadose realização do Projeto Conceitual do diagrama de Entidade Relacionamento do Banco de Dados tanto em formato online (draw.io) e formato local com BrModelo
</commit_message>
<xml_diff>
--- a/docs/Nós 3D.docx
+++ b/docs/Nós 3D.docx
@@ -922,13 +922,7 @@
         <w:rPr>
           <w:rFonts w:ascii="Montserrat" w:hAnsi="Montserrat"/>
         </w:rPr>
-        <w:t xml:space="preserve">Filamentos Utilizados na Impressão: </w:t>
-      </w:r>
-      <w:r>
-        <w:rPr>
-          <w:rFonts w:ascii="Montserrat" w:hAnsi="Montserrat"/>
-        </w:rPr>
-        <w:t xml:space="preserve">Filamento 3d fila, 3d </w:t>
+        <w:t xml:space="preserve">Filamentos Utilizados na Impressão: Filamento 3d fila, 3d </w:t>
       </w:r>
       <w:proofErr w:type="spellStart"/>
       <w:r>
@@ -942,21 +936,7 @@
         <w:rPr>
           <w:rFonts w:ascii="Montserrat" w:hAnsi="Montserrat"/>
         </w:rPr>
-        <w:t xml:space="preserve">, bambu </w:t>
-      </w:r>
-      <w:proofErr w:type="spellStart"/>
-      <w:r>
-        <w:rPr>
-          <w:rFonts w:ascii="Montserrat" w:hAnsi="Montserrat"/>
-        </w:rPr>
-        <w:t>lab</w:t>
-      </w:r>
-      <w:proofErr w:type="spellEnd"/>
-      <w:r>
-        <w:rPr>
-          <w:rFonts w:ascii="Montserrat" w:hAnsi="Montserrat"/>
-        </w:rPr>
-        <w:t>, voolt3d</w:t>
+        <w:t>, bambu lab, voolt3d</w:t>
       </w:r>
     </w:p>
     <w:p>
@@ -1713,6 +1693,13 @@
         <w:lastRenderedPageBreak/>
         <w:t>Atualização do catálogo</w:t>
       </w:r>
+    </w:p>
+    <w:p>
+      <w:pPr>
+        <w:rPr>
+          <w:rFonts w:ascii="Montserrat" w:hAnsi="Montserrat"/>
+        </w:rPr>
+      </w:pPr>
     </w:p>
     <w:sectPr>
       <w:pgSz w:w="11906" w:h="16838"/>

</xml_diff>